<commit_message>
Finished and tested function to add multiple inventors
</commit_message>
<xml_diff>
--- a/project/documents/formaldocuments/ApplicationDataSheet_NEW2inventor.docx
+++ b/project/documents/formaldocuments/ApplicationDataSheet_NEW2inventor.docx
@@ -179,7 +179,23 @@
                 <w:rFonts w:cstheme="minorHAnsi"/>
                 <w:b/>
               </w:rPr>
-              <w:t>Portions or all of the application associated with this Application Data Sheet may fall under a Secrecy Order pursuant to</w:t>
+              <w:t xml:space="preserve">Portions or </w:t>
+            </w:r>
+            <w:proofErr w:type="gramStart"/>
+            <w:r>
+              <w:rPr>
+                <w:rFonts w:cstheme="minorHAnsi"/>
+                <w:b/>
+              </w:rPr>
+              <w:t>all of</w:t>
+            </w:r>
+            <w:proofErr w:type="gramEnd"/>
+            <w:r>
+              <w:rPr>
+                <w:rFonts w:cstheme="minorHAnsi"/>
+                <w:b/>
+              </w:rPr>
+              <w:t xml:space="preserve"> the application associated with this Application Data Sheet may fall under a Secrecy Order pursuant to</w:t>
             </w:r>
             <w:r>
               <w:rPr>
@@ -205,13 +221,25 @@
           <w:tab w:val="left" w:pos="7800"/>
         </w:tabs>
         <w:spacing w:before="44" w:after="0" w:line="417" w:lineRule="exact"/>
-        <w:ind w:right="-20" w:firstLine="180"/>
+        <w:ind w:right="-20"/>
         <w:rPr>
           <w:rFonts w:eastAsia="Arial" w:cstheme="minorHAnsi"/>
           <w:sz w:val="28"/>
           <w:szCs w:val="28"/>
         </w:rPr>
       </w:pPr>
+      <w:r>
+        <w:rPr>
+          <w:rFonts w:eastAsia="Arial" w:cstheme="minorHAnsi"/>
+          <w:b/>
+          <w:bCs/>
+          <w:w w:val="92"/>
+          <w:position w:val="-1"/>
+          <w:sz w:val="28"/>
+          <w:szCs w:val="28"/>
+        </w:rPr>
+        <w:t xml:space="preserve">  </w:t>
+      </w:r>
       <w:r>
         <w:rPr>
           <w:rFonts w:eastAsia="Arial" w:cstheme="minorHAnsi"/>
@@ -249,1567 +277,6 @@
         <w:tab/>
       </w:r>
     </w:p>
-    <w:tbl>
-      <w:tblPr>
-        <w:tblW w:w="10902" w:type="dxa"/>
-        <w:tblInd w:w="101" w:type="dxa"/>
-        <w:tblBorders>
-          <w:top w:val="single" w:sz="2" w:space="0" w:color="000000"/>
-          <w:left w:val="single" w:sz="2" w:space="0" w:color="000000"/>
-          <w:bottom w:val="single" w:sz="2" w:space="0" w:color="000000"/>
-          <w:right w:val="single" w:sz="2" w:space="0" w:color="000000"/>
-          <w:insideH w:val="single" w:sz="2" w:space="0" w:color="000000"/>
-          <w:insideV w:val="single" w:sz="2" w:space="0" w:color="000000"/>
-        </w:tblBorders>
-        <w:tblLayout w:type="fixed"/>
-        <w:tblCellMar>
-          <w:left w:w="0" w:type="dxa"/>
-          <w:right w:w="0" w:type="dxa"/>
-        </w:tblCellMar>
-        <w:tblLook w:val="01E0" w:firstRow="1" w:lastRow="1" w:firstColumn="1" w:lastColumn="1" w:noHBand="0" w:noVBand="0"/>
-      </w:tblPr>
-      <w:tblGrid>
-        <w:gridCol w:w="619"/>
-        <w:gridCol w:w="444"/>
-        <w:gridCol w:w="9"/>
-        <w:gridCol w:w="1159"/>
-        <w:gridCol w:w="14"/>
-        <w:gridCol w:w="717"/>
-        <w:gridCol w:w="1101"/>
-        <w:gridCol w:w="607"/>
-        <w:gridCol w:w="441"/>
-        <w:gridCol w:w="1170"/>
-        <w:gridCol w:w="371"/>
-        <w:gridCol w:w="268"/>
-        <w:gridCol w:w="92"/>
-        <w:gridCol w:w="1170"/>
-        <w:gridCol w:w="808"/>
-        <w:gridCol w:w="1912"/>
-      </w:tblGrid>
-      <w:tr>
-        <w:trPr>
-          <w:trHeight w:hRule="exact" w:val="374"/>
-        </w:trPr>
-        <w:tc>
-          <w:tcPr>
-            <w:tcW w:w="10902" w:type="dxa"/>
-            <w:gridSpan w:val="16"/>
-            <w:tcBorders>
-              <w:top w:val="single" w:sz="18" w:space="0" w:color="000000"/>
-              <w:left w:val="single" w:sz="18" w:space="0" w:color="000000"/>
-              <w:bottom w:val="single" w:sz="18" w:space="0" w:color="000000"/>
-              <w:right w:val="single" w:sz="18" w:space="0" w:color="000000"/>
-            </w:tcBorders>
-            <w:vAlign w:val="center"/>
-          </w:tcPr>
-          <w:p>
-            <w:pPr>
-              <w:keepNext/>
-              <w:widowControl/>
-              <w:tabs>
-                <w:tab w:val="left" w:pos="8620"/>
-              </w:tabs>
-              <w:spacing w:after="0" w:line="240" w:lineRule="auto"/>
-              <w:ind w:left="144" w:right="-14"/>
-              <w:rPr>
-                <w:rFonts w:eastAsia="Arial" w:cstheme="minorHAnsi"/>
-                <w:sz w:val="24"/>
-                <w:szCs w:val="24"/>
-              </w:rPr>
-            </w:pPr>
-            <w:r>
-              <w:rPr>
-                <w:rFonts w:eastAsia="Arial" w:cstheme="minorHAnsi"/>
-                <w:b/>
-                <w:bCs/>
-                <w:spacing w:val="-43"/>
-                <w:position w:val="-4"/>
-                <w:sz w:val="24"/>
-                <w:szCs w:val="24"/>
-              </w:rPr>
-              <w:t xml:space="preserve">  </w:t>
-            </w:r>
-            <w:r>
-              <w:rPr>
-                <w:rFonts w:cstheme="minorHAnsi"/>
-                <w:b/>
-                <w:bCs/>
-                <w:sz w:val="24"/>
-                <w:szCs w:val="24"/>
-              </w:rPr>
-              <w:t>&lt;&lt;inventorCnt&gt;&gt;</w:t>
-            </w:r>
-            <w:r>
-              <w:rPr>
-                <w:rFonts w:cstheme="minorHAnsi"/>
-                <w:b/>
-                <w:bCs/>
-              </w:rPr>
-              <w:t xml:space="preserve"> </w:t>
-            </w:r>
-            <w:r>
-              <w:rPr>
-                <w:rFonts w:cstheme="minorHAnsi"/>
-                <w:b/>
-                <w:bCs/>
-              </w:rPr>
-              <w:t xml:space="preserve">  </w:t>
-            </w:r>
-            <w:r>
-              <w:rPr>
-                <w:rFonts w:cstheme="minorHAnsi"/>
-                <w:bCs/>
-              </w:rPr>
-              <w:t>&lt;&lt;inventor&gt;&gt;</w:t>
-            </w:r>
-          </w:p>
-        </w:tc>
-      </w:tr>
-      <w:tr>
-        <w:trPr>
-          <w:trHeight w:hRule="exact" w:val="346"/>
-        </w:trPr>
-        <w:tc>
-          <w:tcPr>
-            <w:tcW w:w="10902" w:type="dxa"/>
-            <w:gridSpan w:val="16"/>
-            <w:tcBorders>
-              <w:top w:val="single" w:sz="18" w:space="0" w:color="000000"/>
-            </w:tcBorders>
-            <w:vAlign w:val="center"/>
-          </w:tcPr>
-          <w:p>
-            <w:pPr>
-              <w:keepNext/>
-              <w:widowControl/>
-              <w:spacing w:before="21" w:after="0" w:line="240" w:lineRule="auto"/>
-              <w:ind w:left="137" w:right="-57"/>
-              <w:rPr>
-                <w:rFonts w:eastAsia="Arial" w:cstheme="minorHAnsi"/>
-                <w:b/>
-                <w:bCs/>
-                <w:w w:val="106"/>
-                <w:sz w:val="24"/>
-                <w:szCs w:val="24"/>
-              </w:rPr>
-            </w:pPr>
-            <w:r>
-              <w:rPr>
-                <w:rFonts w:eastAsia="Arial" w:cstheme="minorHAnsi"/>
-                <w:b/>
-                <w:bCs/>
-                <w:w w:val="106"/>
-                <w:sz w:val="24"/>
-                <w:szCs w:val="24"/>
-              </w:rPr>
-              <w:t>Legal Name</w:t>
-            </w:r>
-          </w:p>
-        </w:tc>
-      </w:tr>
-      <w:tr>
-        <w:trPr>
-          <w:trHeight w:hRule="exact" w:val="346"/>
-        </w:trPr>
-        <w:tc>
-          <w:tcPr>
-            <w:tcW w:w="1072" w:type="dxa"/>
-            <w:gridSpan w:val="3"/>
-            <w:vAlign w:val="center"/>
-          </w:tcPr>
-          <w:p>
-            <w:pPr>
-              <w:keepNext/>
-              <w:widowControl/>
-              <w:spacing w:after="0" w:line="240" w:lineRule="auto"/>
-              <w:ind w:left="144"/>
-              <w:rPr>
-                <w:rFonts w:eastAsia="Arial" w:cstheme="minorHAnsi"/>
-              </w:rPr>
-            </w:pPr>
-            <w:r>
-              <w:rPr>
-                <w:rFonts w:eastAsia="Arial" w:cstheme="minorHAnsi"/>
-                <w:b/>
-                <w:bCs/>
-                <w:w w:val="104"/>
-              </w:rPr>
-              <w:t>Prefix</w:t>
-            </w:r>
-          </w:p>
-        </w:tc>
-        <w:tc>
-          <w:tcPr>
-            <w:tcW w:w="2991" w:type="dxa"/>
-            <w:gridSpan w:val="4"/>
-            <w:vAlign w:val="center"/>
-          </w:tcPr>
-          <w:p>
-            <w:pPr>
-              <w:keepNext/>
-              <w:widowControl/>
-              <w:spacing w:after="0" w:line="240" w:lineRule="auto"/>
-              <w:ind w:left="43"/>
-              <w:rPr>
-                <w:rFonts w:eastAsia="Arial" w:cstheme="minorHAnsi"/>
-              </w:rPr>
-            </w:pPr>
-            <w:r>
-              <w:rPr>
-                <w:rFonts w:eastAsia="Arial" w:cstheme="minorHAnsi"/>
-                <w:b/>
-                <w:bCs/>
-              </w:rPr>
-              <w:t>Given</w:t>
-            </w:r>
-            <w:r>
-              <w:rPr>
-                <w:rFonts w:eastAsia="Arial" w:cstheme="minorHAnsi"/>
-                <w:b/>
-                <w:bCs/>
-                <w:spacing w:val="31"/>
-              </w:rPr>
-              <w:t xml:space="preserve"> </w:t>
-            </w:r>
-            <w:r>
-              <w:rPr>
-                <w:rFonts w:eastAsia="Arial" w:cstheme="minorHAnsi"/>
-                <w:b/>
-                <w:bCs/>
-                <w:w w:val="107"/>
-              </w:rPr>
-              <w:t>Name</w:t>
-            </w:r>
-          </w:p>
-        </w:tc>
-        <w:tc>
-          <w:tcPr>
-            <w:tcW w:w="2589" w:type="dxa"/>
-            <w:gridSpan w:val="4"/>
-            <w:vAlign w:val="center"/>
-          </w:tcPr>
-          <w:p>
-            <w:pPr>
-              <w:keepNext/>
-              <w:widowControl/>
-              <w:spacing w:after="0" w:line="240" w:lineRule="auto"/>
-              <w:ind w:left="144"/>
-              <w:rPr>
-                <w:rFonts w:eastAsia="Arial" w:cstheme="minorHAnsi"/>
-              </w:rPr>
-            </w:pPr>
-            <w:r>
-              <w:rPr>
-                <w:rFonts w:eastAsia="Arial" w:cstheme="minorHAnsi"/>
-                <w:b/>
-                <w:bCs/>
-              </w:rPr>
-              <w:t>Middle</w:t>
-            </w:r>
-            <w:r>
-              <w:rPr>
-                <w:rFonts w:eastAsia="Arial" w:cstheme="minorHAnsi"/>
-                <w:b/>
-                <w:bCs/>
-                <w:spacing w:val="34"/>
-              </w:rPr>
-              <w:t xml:space="preserve"> </w:t>
-            </w:r>
-            <w:r>
-              <w:rPr>
-                <w:rFonts w:eastAsia="Arial" w:cstheme="minorHAnsi"/>
-                <w:b/>
-                <w:bCs/>
-                <w:w w:val="106"/>
-              </w:rPr>
-              <w:t>Name</w:t>
-            </w:r>
-          </w:p>
-        </w:tc>
-        <w:tc>
-          <w:tcPr>
-            <w:tcW w:w="2338" w:type="dxa"/>
-            <w:gridSpan w:val="4"/>
-            <w:vAlign w:val="center"/>
-          </w:tcPr>
-          <w:p>
-            <w:pPr>
-              <w:keepNext/>
-              <w:widowControl/>
-              <w:spacing w:after="0" w:line="240" w:lineRule="auto"/>
-              <w:ind w:left="144"/>
-              <w:rPr>
-                <w:rFonts w:eastAsia="Arial" w:cstheme="minorHAnsi"/>
-              </w:rPr>
-            </w:pPr>
-            <w:r>
-              <w:rPr>
-                <w:rFonts w:eastAsia="Arial" w:cstheme="minorHAnsi"/>
-                <w:b/>
-                <w:bCs/>
-              </w:rPr>
-              <w:t>Family</w:t>
-            </w:r>
-            <w:r>
-              <w:rPr>
-                <w:rFonts w:eastAsia="Arial" w:cstheme="minorHAnsi"/>
-                <w:b/>
-                <w:bCs/>
-                <w:spacing w:val="32"/>
-              </w:rPr>
-              <w:t xml:space="preserve"> </w:t>
-            </w:r>
-            <w:r>
-              <w:rPr>
-                <w:rFonts w:eastAsia="Arial" w:cstheme="minorHAnsi"/>
-                <w:b/>
-                <w:bCs/>
-                <w:w w:val="106"/>
-              </w:rPr>
-              <w:t>Name</w:t>
-            </w:r>
-          </w:p>
-        </w:tc>
-        <w:tc>
-          <w:tcPr>
-            <w:tcW w:w="1912" w:type="dxa"/>
-            <w:vAlign w:val="center"/>
-          </w:tcPr>
-          <w:p>
-            <w:pPr>
-              <w:keepNext/>
-              <w:widowControl/>
-              <w:spacing w:after="0" w:line="240" w:lineRule="auto"/>
-              <w:ind w:left="144"/>
-              <w:rPr>
-                <w:rFonts w:eastAsia="Arial" w:cstheme="minorHAnsi"/>
-              </w:rPr>
-            </w:pPr>
-            <w:r>
-              <w:rPr>
-                <w:rFonts w:eastAsia="Arial" w:cstheme="minorHAnsi"/>
-                <w:b/>
-                <w:bCs/>
-                <w:w w:val="106"/>
-              </w:rPr>
-              <w:t>Suffix</w:t>
-            </w:r>
-          </w:p>
-        </w:tc>
-      </w:tr>
-      <w:tr>
-        <w:trPr>
-          <w:trHeight w:hRule="exact" w:val="394"/>
-        </w:trPr>
-        <w:tc>
-          <w:tcPr>
-            <w:tcW w:w="1072" w:type="dxa"/>
-            <w:gridSpan w:val="3"/>
-            <w:vAlign w:val="center"/>
-          </w:tcPr>
-          <w:p>
-            <w:pPr>
-              <w:keepNext/>
-              <w:widowControl/>
-              <w:spacing w:after="0" w:line="240" w:lineRule="auto"/>
-              <w:jc w:val="center"/>
-              <w:rPr>
-                <w:rFonts w:eastAsia="Times New Roman" w:cstheme="minorHAnsi"/>
-              </w:rPr>
-            </w:pPr>
-            <w:r>
-              <w:rPr>
-                <w:rFonts w:eastAsia="Times New Roman" w:cstheme="minorHAnsi"/>
-              </w:rPr>
-              <w:t>&lt;</w:t>
-            </w:r>
-            <w:r>
-              <w:rPr>
-                <w:rFonts w:eastAsia="Times New Roman" w:cstheme="minorHAnsi"/>
-              </w:rPr>
-              <w:t>&lt;invpre&gt;&gt;</w:t>
-            </w:r>
-          </w:p>
-        </w:tc>
-        <w:tc>
-          <w:tcPr>
-            <w:tcW w:w="2991" w:type="dxa"/>
-            <w:gridSpan w:val="4"/>
-            <w:vAlign w:val="center"/>
-          </w:tcPr>
-          <w:p>
-            <w:pPr>
-              <w:keepNext/>
-              <w:widowControl/>
-              <w:spacing w:after="0" w:line="240" w:lineRule="auto"/>
-              <w:ind w:left="43"/>
-              <w:rPr>
-                <w:rFonts w:cstheme="minorHAnsi"/>
-              </w:rPr>
-            </w:pPr>
-            <w:r>
-              <w:rPr>
-                <w:rFonts w:cstheme="minorHAnsi"/>
-                <w:bCs/>
-              </w:rPr>
-              <w:t>&lt;</w:t>
-            </w:r>
-            <w:r>
-              <w:rPr>
-                <w:rFonts w:cstheme="minorHAnsi"/>
-                <w:bCs/>
-              </w:rPr>
-              <w:t>&lt;inventorFirstName&gt;&gt;</w:t>
-            </w:r>
-          </w:p>
-        </w:tc>
-        <w:tc>
-          <w:tcPr>
-            <w:tcW w:w="2589" w:type="dxa"/>
-            <w:gridSpan w:val="4"/>
-            <w:vAlign w:val="center"/>
-          </w:tcPr>
-          <w:p>
-            <w:pPr>
-              <w:keepNext/>
-              <w:widowControl/>
-              <w:spacing w:after="0" w:line="240" w:lineRule="auto"/>
-              <w:ind w:left="43"/>
-              <w:rPr>
-                <w:rFonts w:cstheme="minorHAnsi"/>
-              </w:rPr>
-            </w:pPr>
-            <w:r>
-              <w:rPr>
-                <w:rFonts w:cstheme="minorHAnsi"/>
-              </w:rPr>
-              <w:t>&lt;&lt;inventorMiddleInitial&gt;&gt;</w:t>
-            </w:r>
-          </w:p>
-        </w:tc>
-        <w:tc>
-          <w:tcPr>
-            <w:tcW w:w="2338" w:type="dxa"/>
-            <w:gridSpan w:val="4"/>
-            <w:vAlign w:val="center"/>
-          </w:tcPr>
-          <w:p>
-            <w:pPr>
-              <w:keepNext/>
-              <w:widowControl/>
-              <w:spacing w:after="0" w:line="240" w:lineRule="auto"/>
-              <w:ind w:left="43"/>
-              <w:rPr>
-                <w:rFonts w:cstheme="minorHAnsi"/>
-              </w:rPr>
-            </w:pPr>
-            <w:r>
-              <w:rPr>
-                <w:rFonts w:cstheme="minorHAnsi"/>
-                <w:bCs/>
-              </w:rPr>
-              <w:t>&lt;</w:t>
-            </w:r>
-            <w:r>
-              <w:rPr>
-                <w:rFonts w:cstheme="minorHAnsi"/>
-                <w:bCs/>
-              </w:rPr>
-              <w:t>&lt;inventorLastName&gt;&gt;</w:t>
-            </w:r>
-          </w:p>
-        </w:tc>
-        <w:tc>
-          <w:tcPr>
-            <w:tcW w:w="1912" w:type="dxa"/>
-            <w:vAlign w:val="center"/>
-          </w:tcPr>
-          <w:p>
-            <w:pPr>
-              <w:keepNext/>
-              <w:widowControl/>
-              <w:spacing w:after="0" w:line="240" w:lineRule="auto"/>
-              <w:ind w:left="43"/>
-              <w:rPr>
-                <w:rFonts w:eastAsia="Times New Roman" w:cstheme="minorHAnsi"/>
-              </w:rPr>
-            </w:pPr>
-            <w:r>
-              <w:rPr>
-                <w:rFonts w:eastAsia="Times New Roman" w:cstheme="minorHAnsi"/>
-              </w:rPr>
-              <w:t>&lt;&lt;inventorSuffix&gt;&gt;</w:t>
-            </w:r>
-          </w:p>
-        </w:tc>
-      </w:tr>
-      <w:tr>
-        <w:trPr>
-          <w:trHeight w:hRule="exact" w:val="673"/>
-        </w:trPr>
-        <w:tc>
-          <w:tcPr>
-            <w:tcW w:w="10902" w:type="dxa"/>
-            <w:gridSpan w:val="16"/>
-            <w:vAlign w:val="center"/>
-          </w:tcPr>
-          <w:p>
-            <w:pPr>
-              <w:tabs>
-                <w:tab w:val="left" w:pos="5500"/>
-                <w:tab w:val="left" w:pos="7660"/>
-              </w:tabs>
-              <w:spacing w:after="0" w:line="261" w:lineRule="exact"/>
-              <w:ind w:right="-20"/>
-              <w:rPr>
-                <w:rFonts w:eastAsia="Arial" w:cstheme="minorHAnsi"/>
-                <w:b/>
-                <w:bCs/>
-                <w:position w:val="2"/>
-              </w:rPr>
-            </w:pPr>
-            <w:r>
-              <w:rPr>
-                <w:rFonts w:eastAsia="Arial" w:cstheme="minorHAnsi"/>
-                <w:b/>
-                <w:bCs/>
-                <w:position w:val="2"/>
-              </w:rPr>
-              <w:t xml:space="preserve">  </w:t>
-            </w:r>
-            <w:r>
-              <w:rPr>
-                <w:rFonts w:eastAsia="Arial" w:cstheme="minorHAnsi"/>
-                <w:b/>
-                <w:bCs/>
-                <w:position w:val="2"/>
-              </w:rPr>
-              <w:t>Residence</w:t>
-            </w:r>
-            <w:r>
-              <w:rPr>
-                <w:rFonts w:eastAsia="Arial" w:cstheme="minorHAnsi"/>
-                <w:b/>
-                <w:bCs/>
-                <w:spacing w:val="37"/>
-                <w:position w:val="2"/>
-              </w:rPr>
-              <w:t xml:space="preserve"> </w:t>
-            </w:r>
-            <w:r>
-              <w:rPr>
-                <w:rFonts w:eastAsia="Arial" w:cstheme="minorHAnsi"/>
-                <w:b/>
-                <w:bCs/>
-                <w:position w:val="2"/>
-              </w:rPr>
-              <w:t>Information</w:t>
-            </w:r>
-            <w:r>
-              <w:rPr>
-                <w:rFonts w:eastAsia="Arial" w:cstheme="minorHAnsi"/>
-                <w:b/>
-                <w:bCs/>
-                <w:spacing w:val="45"/>
-                <w:position w:val="2"/>
-              </w:rPr>
-              <w:t xml:space="preserve"> </w:t>
-            </w:r>
-            <w:r>
-              <w:rPr>
-                <w:rFonts w:eastAsia="Arial" w:cstheme="minorHAnsi"/>
-                <w:b/>
-                <w:bCs/>
-                <w:position w:val="2"/>
-              </w:rPr>
-              <w:t>(Select</w:t>
-            </w:r>
-            <w:r>
-              <w:rPr>
-                <w:rFonts w:eastAsia="Arial" w:cstheme="minorHAnsi"/>
-                <w:b/>
-                <w:bCs/>
-                <w:spacing w:val="25"/>
-                <w:position w:val="2"/>
-              </w:rPr>
-              <w:t xml:space="preserve"> </w:t>
-            </w:r>
-            <w:r>
-              <w:rPr>
-                <w:rFonts w:eastAsia="Arial" w:cstheme="minorHAnsi"/>
-                <w:b/>
-                <w:bCs/>
-                <w:position w:val="2"/>
-              </w:rPr>
-              <w:t>One)</w:t>
-            </w:r>
-          </w:p>
-          <w:p>
-            <w:pPr>
-              <w:tabs>
-                <w:tab w:val="left" w:pos="5500"/>
-                <w:tab w:val="left" w:pos="7660"/>
-              </w:tabs>
-              <w:spacing w:after="0" w:line="261" w:lineRule="exact"/>
-              <w:ind w:left="209" w:right="-20"/>
-              <w:rPr>
-                <w:rFonts w:eastAsia="Arial" w:cstheme="minorHAnsi"/>
-                <w:b/>
-              </w:rPr>
-            </w:pPr>
-            <w:r>
-              <w:rPr>
-                <w:rFonts w:eastAsia="Arial" w:cstheme="minorHAnsi"/>
-                <w:b/>
-                <w:bCs/>
-                <w:position w:val="2"/>
-              </w:rPr>
-              <w:t xml:space="preserve">                                         </w:t>
-            </w:r>
-            <w:r>
-              <w:rPr>
-                <w:rFonts w:eastAsia="Arial" w:cstheme="minorHAnsi"/>
-                <w:b/>
-                <w:bCs/>
-                <w:position w:val="2"/>
-              </w:rPr>
-              <w:t xml:space="preserve">                           </w:t>
-            </w:r>
-            <w:sdt>
-              <w:sdtPr>
-                <w:rPr>
-                  <w:rFonts w:eastAsia="Arial" w:cstheme="minorHAnsi"/>
-                  <w:b/>
-                  <w:bCs/>
-                  <w:spacing w:val="13"/>
-                  <w:position w:val="2"/>
-                  <w:sz w:val="24"/>
-                  <w:szCs w:val="24"/>
-                </w:rPr>
-                <w:id w:val="-830977886"/>
-                <w14:checkbox>
-                  <w14:checked w14:val="0"/>
-                  <w14:checkedState w14:val="2612" w14:font="MS Gothic"/>
-                  <w14:uncheckedState w14:val="2610" w14:font="MS Gothic"/>
-                </w14:checkbox>
-              </w:sdtPr>
-              <w:sdtContent>
-                <w:r>
-                  <w:rPr>
-                    <w:rFonts w:ascii="MS Gothic" w:eastAsia="MS Gothic" w:hAnsi="MS Gothic" w:cstheme="minorHAnsi" w:hint="eastAsia"/>
-                    <w:b/>
-                    <w:bCs/>
-                    <w:spacing w:val="13"/>
-                    <w:position w:val="2"/>
-                    <w:sz w:val="24"/>
-                    <w:szCs w:val="24"/>
-                  </w:rPr>
-                  <w:t>☐</w:t>
-                </w:r>
-              </w:sdtContent>
-            </w:sdt>
-            <w:r>
-              <w:rPr>
-                <w:rFonts w:eastAsia="Arial" w:cstheme="minorHAnsi"/>
-                <w:b/>
-                <w:position w:val="4"/>
-              </w:rPr>
-              <w:t>US</w:t>
-            </w:r>
-            <w:r>
-              <w:rPr>
-                <w:rFonts w:eastAsia="Arial" w:cstheme="minorHAnsi"/>
-                <w:b/>
-                <w:spacing w:val="18"/>
-                <w:position w:val="4"/>
-              </w:rPr>
-              <w:t xml:space="preserve"> </w:t>
-            </w:r>
-            <w:r>
-              <w:rPr>
-                <w:rFonts w:eastAsia="Arial" w:cstheme="minorHAnsi"/>
-                <w:b/>
-                <w:position w:val="4"/>
-              </w:rPr>
-              <w:t>Residency</w:t>
-            </w:r>
-            <w:r>
-              <w:rPr>
-                <w:rFonts w:eastAsia="Arial" w:cstheme="minorHAnsi"/>
-                <w:b/>
-                <w:position w:val="4"/>
-              </w:rPr>
-              <w:tab/>
-            </w:r>
-            <w:sdt>
-              <w:sdtPr>
-                <w:rPr>
-                  <w:rFonts w:eastAsia="Arial" w:cstheme="minorHAnsi"/>
-                  <w:b/>
-                  <w:bCs/>
-                  <w:spacing w:val="13"/>
-                  <w:position w:val="2"/>
-                  <w:sz w:val="24"/>
-                  <w:szCs w:val="24"/>
-                </w:rPr>
-                <w:id w:val="-1318641333"/>
-                <w14:checkbox>
-                  <w14:checked w14:val="0"/>
-                  <w14:checkedState w14:val="2612" w14:font="MS Gothic"/>
-                  <w14:uncheckedState w14:val="2610" w14:font="MS Gothic"/>
-                </w14:checkbox>
-              </w:sdtPr>
-              <w:sdtContent>
-                <w:r>
-                  <w:rPr>
-                    <w:rFonts w:ascii="MS Gothic" w:eastAsia="MS Gothic" w:hAnsi="MS Gothic" w:cs="MS Gothic" w:hint="eastAsia"/>
-                    <w:b/>
-                    <w:bCs/>
-                    <w:spacing w:val="13"/>
-                    <w:position w:val="2"/>
-                    <w:sz w:val="24"/>
-                    <w:szCs w:val="24"/>
-                  </w:rPr>
-                  <w:t>☐</w:t>
-                </w:r>
-              </w:sdtContent>
-            </w:sdt>
-            <w:r>
-              <w:rPr>
-                <w:rFonts w:eastAsia="Arial" w:cstheme="minorHAnsi"/>
-                <w:b/>
-                <w:position w:val="4"/>
-              </w:rPr>
-              <w:t>Non US</w:t>
-            </w:r>
-            <w:r>
-              <w:rPr>
-                <w:rFonts w:eastAsia="Arial" w:cstheme="minorHAnsi"/>
-                <w:b/>
-                <w:spacing w:val="18"/>
-                <w:position w:val="4"/>
-              </w:rPr>
-              <w:t xml:space="preserve"> </w:t>
-            </w:r>
-            <w:r>
-              <w:rPr>
-                <w:rFonts w:eastAsia="Arial" w:cstheme="minorHAnsi"/>
-                <w:b/>
-                <w:position w:val="4"/>
-              </w:rPr>
-              <w:t>Residency</w:t>
-            </w:r>
-            <w:r>
-              <w:rPr>
-                <w:rFonts w:eastAsia="Arial" w:cstheme="minorHAnsi"/>
-                <w:b/>
-                <w:position w:val="4"/>
-              </w:rPr>
-              <w:tab/>
-            </w:r>
-            <w:sdt>
-              <w:sdtPr>
-                <w:rPr>
-                  <w:rFonts w:eastAsia="Arial" w:cstheme="minorHAnsi"/>
-                  <w:b/>
-                  <w:bCs/>
-                  <w:spacing w:val="13"/>
-                  <w:position w:val="2"/>
-                  <w:sz w:val="24"/>
-                  <w:szCs w:val="24"/>
-                </w:rPr>
-                <w:id w:val="-1686589593"/>
-                <w14:checkbox>
-                  <w14:checked w14:val="0"/>
-                  <w14:checkedState w14:val="2612" w14:font="MS Gothic"/>
-                  <w14:uncheckedState w14:val="2610" w14:font="MS Gothic"/>
-                </w14:checkbox>
-              </w:sdtPr>
-              <w:sdtContent>
-                <w:r>
-                  <w:rPr>
-                    <w:rFonts w:ascii="MS Gothic" w:eastAsia="MS Gothic" w:hAnsi="MS Gothic" w:cstheme="minorHAnsi" w:hint="eastAsia"/>
-                    <w:b/>
-                    <w:bCs/>
-                    <w:spacing w:val="13"/>
-                    <w:position w:val="2"/>
-                    <w:sz w:val="24"/>
-                    <w:szCs w:val="24"/>
-                  </w:rPr>
-                  <w:t>☐</w:t>
-                </w:r>
-              </w:sdtContent>
-            </w:sdt>
-            <w:r>
-              <w:rPr>
-                <w:rFonts w:eastAsia="Arial" w:cstheme="minorHAnsi"/>
-                <w:b/>
-                <w:position w:val="4"/>
-              </w:rPr>
-              <w:t>Active US Military Service</w:t>
-            </w:r>
-          </w:p>
-        </w:tc>
-      </w:tr>
-      <w:tr>
-        <w:trPr>
-          <w:trHeight w:hRule="exact" w:val="646"/>
-        </w:trPr>
-        <w:tc>
-          <w:tcPr>
-            <w:tcW w:w="619" w:type="dxa"/>
-            <w:vAlign w:val="center"/>
-          </w:tcPr>
-          <w:p>
-            <w:pPr>
-              <w:spacing w:before="36" w:after="0" w:line="240" w:lineRule="auto"/>
-              <w:ind w:left="137" w:right="-20"/>
-              <w:rPr>
-                <w:rFonts w:eastAsia="Arial" w:cstheme="minorHAnsi"/>
-              </w:rPr>
-            </w:pPr>
-            <w:r>
-              <w:rPr>
-                <w:rFonts w:eastAsia="Arial" w:cstheme="minorHAnsi"/>
-                <w:b/>
-                <w:bCs/>
-                <w:w w:val="109"/>
-              </w:rPr>
-              <w:t>City</w:t>
-            </w:r>
-          </w:p>
-        </w:tc>
-        <w:tc>
-          <w:tcPr>
-            <w:tcW w:w="2343" w:type="dxa"/>
-            <w:gridSpan w:val="5"/>
-            <w:vAlign w:val="center"/>
-          </w:tcPr>
-          <w:p>
-            <w:pPr>
-              <w:tabs>
-                <w:tab w:val="left" w:pos="2420"/>
-                <w:tab w:val="left" w:pos="4840"/>
-              </w:tabs>
-              <w:spacing w:before="40" w:after="0" w:line="240" w:lineRule="auto"/>
-              <w:ind w:left="137" w:right="-20"/>
-              <w:rPr>
-                <w:rFonts w:eastAsia="Arial" w:cstheme="minorHAnsi"/>
-              </w:rPr>
-            </w:pPr>
-            <w:r>
-              <w:rPr>
-                <w:rFonts w:eastAsia="Arial" w:cstheme="minorHAnsi"/>
-                <w:bCs/>
-              </w:rPr>
-              <w:t>&lt;&lt;inventorHomeCity&gt;&gt;</w:t>
-            </w:r>
-          </w:p>
-        </w:tc>
-        <w:tc>
-          <w:tcPr>
-            <w:tcW w:w="1708" w:type="dxa"/>
-            <w:gridSpan w:val="2"/>
-            <w:vAlign w:val="center"/>
-          </w:tcPr>
-          <w:p>
-            <w:pPr>
-              <w:tabs>
-                <w:tab w:val="left" w:pos="2420"/>
-                <w:tab w:val="left" w:pos="4840"/>
-              </w:tabs>
-              <w:spacing w:before="40" w:after="0" w:line="240" w:lineRule="auto"/>
-              <w:ind w:left="43" w:right="-14"/>
-              <w:rPr>
-                <w:rFonts w:eastAsia="Arial" w:cstheme="minorHAnsi"/>
-              </w:rPr>
-            </w:pPr>
-            <w:r>
-              <w:rPr>
-                <w:rFonts w:eastAsia="Arial" w:cstheme="minorHAnsi"/>
-                <w:b/>
-                <w:bCs/>
-                <w:w w:val="116"/>
-                <w:position w:val="1"/>
-              </w:rPr>
-              <w:t>State/Province</w:t>
-            </w:r>
-          </w:p>
-        </w:tc>
-        <w:tc>
-          <w:tcPr>
-            <w:tcW w:w="2342" w:type="dxa"/>
-            <w:gridSpan w:val="5"/>
-            <w:vAlign w:val="center"/>
-          </w:tcPr>
-          <w:p>
-            <w:pPr>
-              <w:tabs>
-                <w:tab w:val="left" w:pos="2420"/>
-                <w:tab w:val="left" w:pos="4840"/>
-              </w:tabs>
-              <w:spacing w:before="40" w:after="0" w:line="240" w:lineRule="auto"/>
-              <w:ind w:left="43" w:right="-14"/>
-              <w:rPr>
-                <w:rFonts w:eastAsia="Arial" w:cstheme="minorHAnsi"/>
-              </w:rPr>
-            </w:pPr>
-            <w:r>
-              <w:rPr>
-                <w:rFonts w:eastAsia="Arial" w:cstheme="minorHAnsi"/>
-                <w:bCs/>
-              </w:rPr>
-              <w:t>&lt;&lt;inventorHomeState&gt;&gt;</w:t>
-            </w:r>
-          </w:p>
-        </w:tc>
-        <w:tc>
-          <w:tcPr>
-            <w:tcW w:w="1170" w:type="dxa"/>
-            <w:vAlign w:val="center"/>
-          </w:tcPr>
-          <w:p>
-            <w:pPr>
-              <w:tabs>
-                <w:tab w:val="left" w:pos="2420"/>
-                <w:tab w:val="left" w:pos="4840"/>
-              </w:tabs>
-              <w:spacing w:before="40" w:after="0" w:line="240" w:lineRule="auto"/>
-              <w:ind w:right="-20"/>
-              <w:jc w:val="center"/>
-              <w:rPr>
-                <w:rFonts w:eastAsia="Arial" w:cstheme="minorHAnsi"/>
-              </w:rPr>
-            </w:pPr>
-            <w:r>
-              <w:rPr>
-                <w:rFonts w:eastAsia="Arial" w:cstheme="minorHAnsi"/>
-                <w:b/>
-                <w:bCs/>
-              </w:rPr>
-              <w:t>Country</w:t>
-            </w:r>
-            <w:r>
-              <w:rPr>
-                <w:rFonts w:eastAsia="Arial" w:cstheme="minorHAnsi"/>
-                <w:b/>
-                <w:bCs/>
-                <w:spacing w:val="39"/>
-              </w:rPr>
-              <w:t xml:space="preserve"> </w:t>
-            </w:r>
-            <w:r>
-              <w:rPr>
-                <w:rFonts w:eastAsia="Arial" w:cstheme="minorHAnsi"/>
-                <w:b/>
-                <w:bCs/>
-              </w:rPr>
-              <w:t>of</w:t>
-            </w:r>
-            <w:r>
-              <w:rPr>
-                <w:rFonts w:eastAsia="Arial" w:cstheme="minorHAnsi"/>
-                <w:b/>
-                <w:bCs/>
-                <w:spacing w:val="22"/>
-              </w:rPr>
-              <w:t xml:space="preserve"> </w:t>
-            </w:r>
-            <w:r>
-              <w:rPr>
-                <w:rFonts w:eastAsia="Arial" w:cstheme="minorHAnsi"/>
-                <w:b/>
-                <w:bCs/>
-              </w:rPr>
-              <w:t>Residence</w:t>
-            </w:r>
-          </w:p>
-        </w:tc>
-        <w:tc>
-          <w:tcPr>
-            <w:tcW w:w="2720" w:type="dxa"/>
-            <w:gridSpan w:val="2"/>
-            <w:vAlign w:val="center"/>
-          </w:tcPr>
-          <w:p>
-            <w:pPr>
-              <w:tabs>
-                <w:tab w:val="left" w:pos="2420"/>
-                <w:tab w:val="left" w:pos="4840"/>
-              </w:tabs>
-              <w:spacing w:before="40" w:after="0" w:line="240" w:lineRule="auto"/>
-              <w:ind w:right="-20"/>
-              <w:rPr>
-                <w:rFonts w:eastAsia="Arial" w:cstheme="minorHAnsi"/>
-              </w:rPr>
-            </w:pPr>
-            <w:r>
-              <w:rPr>
-                <w:rFonts w:eastAsia="Arial" w:cstheme="minorHAnsi"/>
-              </w:rPr>
-              <w:t>&lt;&lt;inventorHomeCountry&gt;&gt;</w:t>
-            </w:r>
-          </w:p>
-        </w:tc>
-      </w:tr>
-      <w:tr>
-        <w:trPr>
-          <w:trHeight w:hRule="exact" w:val="403"/>
-        </w:trPr>
-        <w:tc>
-          <w:tcPr>
-            <w:tcW w:w="10902" w:type="dxa"/>
-            <w:gridSpan w:val="16"/>
-            <w:vAlign w:val="center"/>
-          </w:tcPr>
-          <w:p>
-            <w:pPr>
-              <w:spacing w:after="0" w:line="240" w:lineRule="auto"/>
-              <w:ind w:left="144" w:right="-144"/>
-              <w:rPr>
-                <w:rFonts w:eastAsia="Arial" w:cstheme="minorHAnsi"/>
-              </w:rPr>
-            </w:pPr>
-            <w:r>
-              <w:rPr>
-                <w:rFonts w:eastAsia="Arial" w:cstheme="minorHAnsi"/>
-                <w:b/>
-                <w:bCs/>
-              </w:rPr>
-              <w:t>Mailing</w:t>
-            </w:r>
-            <w:r>
-              <w:rPr>
-                <w:rFonts w:eastAsia="Arial" w:cstheme="minorHAnsi"/>
-                <w:b/>
-                <w:bCs/>
-                <w:spacing w:val="18"/>
-              </w:rPr>
-              <w:t xml:space="preserve"> </w:t>
-            </w:r>
-            <w:r>
-              <w:rPr>
-                <w:rFonts w:eastAsia="Arial" w:cstheme="minorHAnsi"/>
-                <w:b/>
-                <w:bCs/>
-              </w:rPr>
-              <w:t>Address</w:t>
-            </w:r>
-            <w:r>
-              <w:rPr>
-                <w:rFonts w:eastAsia="Arial" w:cstheme="minorHAnsi"/>
-                <w:b/>
-                <w:bCs/>
-                <w:spacing w:val="34"/>
-              </w:rPr>
-              <w:t xml:space="preserve"> </w:t>
-            </w:r>
-            <w:r>
-              <w:rPr>
-                <w:rFonts w:eastAsia="Arial" w:cstheme="minorHAnsi"/>
-                <w:b/>
-                <w:bCs/>
-              </w:rPr>
-              <w:t>of</w:t>
-            </w:r>
-            <w:r>
-              <w:rPr>
-                <w:rFonts w:eastAsia="Arial" w:cstheme="minorHAnsi"/>
-                <w:b/>
-                <w:bCs/>
-                <w:spacing w:val="21"/>
-              </w:rPr>
-              <w:t xml:space="preserve"> </w:t>
-            </w:r>
-            <w:r>
-              <w:rPr>
-                <w:rFonts w:eastAsia="Arial" w:cstheme="minorHAnsi"/>
-                <w:b/>
-                <w:bCs/>
-                <w:w w:val="105"/>
-              </w:rPr>
-              <w:t xml:space="preserve">Inventor: </w:t>
-            </w:r>
-          </w:p>
-        </w:tc>
-      </w:tr>
-      <w:tr>
-        <w:trPr>
-          <w:trHeight w:hRule="exact" w:val="346"/>
-        </w:trPr>
-        <w:tc>
-          <w:tcPr>
-            <w:tcW w:w="2245" w:type="dxa"/>
-            <w:gridSpan w:val="5"/>
-            <w:vAlign w:val="center"/>
-          </w:tcPr>
-          <w:p>
-            <w:pPr>
-              <w:spacing w:after="0" w:line="240" w:lineRule="auto"/>
-              <w:ind w:left="144" w:right="-144"/>
-              <w:rPr>
-                <w:rFonts w:eastAsia="Arial" w:cstheme="minorHAnsi"/>
-              </w:rPr>
-            </w:pPr>
-            <w:r>
-              <w:rPr>
-                <w:rFonts w:eastAsia="Arial" w:cstheme="minorHAnsi"/>
-                <w:b/>
-                <w:bCs/>
-              </w:rPr>
-              <w:t>Address</w:t>
-            </w:r>
-            <w:r>
-              <w:rPr>
-                <w:rFonts w:eastAsia="Arial" w:cstheme="minorHAnsi"/>
-                <w:b/>
-                <w:bCs/>
-                <w:spacing w:val="33"/>
-              </w:rPr>
-              <w:t xml:space="preserve"> </w:t>
-            </w:r>
-            <w:r>
-              <w:rPr>
-                <w:rFonts w:eastAsia="Arial" w:cstheme="minorHAnsi"/>
-                <w:b/>
-                <w:bCs/>
-                <w:w w:val="121"/>
-              </w:rPr>
-              <w:t>1</w:t>
-            </w:r>
-          </w:p>
-        </w:tc>
-        <w:tc>
-          <w:tcPr>
-            <w:tcW w:w="8657" w:type="dxa"/>
-            <w:gridSpan w:val="11"/>
-            <w:vAlign w:val="center"/>
-          </w:tcPr>
-          <w:p>
-            <w:pPr>
-              <w:spacing w:after="0" w:line="240" w:lineRule="auto"/>
-              <w:ind w:left="43"/>
-              <w:rPr>
-                <w:rFonts w:cstheme="minorHAnsi"/>
-              </w:rPr>
-            </w:pPr>
-            <w:r>
-              <w:rPr>
-                <w:rFonts w:cs="Arial"/>
-              </w:rPr>
-              <w:t>&lt;</w:t>
-            </w:r>
-            <w:r>
-              <w:rPr>
-                <w:rFonts w:cs="Arial"/>
-              </w:rPr>
-              <w:t>&lt;inventorMailingStreet</w:t>
-            </w:r>
-            <w:r>
-              <w:rPr>
-                <w:rFonts w:cs="Arial"/>
-              </w:rPr>
-              <w:t>1</w:t>
-            </w:r>
-            <w:r>
-              <w:rPr>
-                <w:rFonts w:cs="Arial"/>
-              </w:rPr>
-              <w:t>&gt;&gt;</w:t>
-            </w:r>
-          </w:p>
-        </w:tc>
-      </w:tr>
-      <w:tr>
-        <w:trPr>
-          <w:trHeight w:hRule="exact" w:val="360"/>
-        </w:trPr>
-        <w:tc>
-          <w:tcPr>
-            <w:tcW w:w="2245" w:type="dxa"/>
-            <w:gridSpan w:val="5"/>
-            <w:vAlign w:val="center"/>
-          </w:tcPr>
-          <w:p>
-            <w:pPr>
-              <w:spacing w:after="0" w:line="240" w:lineRule="auto"/>
-              <w:ind w:left="144" w:right="-144"/>
-              <w:rPr>
-                <w:rFonts w:eastAsia="Arial" w:cstheme="minorHAnsi"/>
-              </w:rPr>
-            </w:pPr>
-            <w:r>
-              <w:rPr>
-                <w:rFonts w:eastAsia="Arial" w:cstheme="minorHAnsi"/>
-                <w:b/>
-                <w:bCs/>
-              </w:rPr>
-              <w:t>Address</w:t>
-            </w:r>
-            <w:r>
-              <w:rPr>
-                <w:rFonts w:eastAsia="Arial" w:cstheme="minorHAnsi"/>
-                <w:b/>
-                <w:bCs/>
-                <w:spacing w:val="43"/>
-              </w:rPr>
-              <w:t xml:space="preserve"> </w:t>
-            </w:r>
-            <w:r>
-              <w:rPr>
-                <w:rFonts w:eastAsia="Arial" w:cstheme="minorHAnsi"/>
-                <w:b/>
-                <w:bCs/>
-                <w:w w:val="110"/>
-              </w:rPr>
-              <w:t>2</w:t>
-            </w:r>
-          </w:p>
-        </w:tc>
-        <w:tc>
-          <w:tcPr>
-            <w:tcW w:w="8657" w:type="dxa"/>
-            <w:gridSpan w:val="11"/>
-            <w:vAlign w:val="center"/>
-          </w:tcPr>
-          <w:p>
-            <w:pPr>
-              <w:spacing w:after="0" w:line="240" w:lineRule="auto"/>
-              <w:ind w:right="-144"/>
-              <w:rPr>
-                <w:rFonts w:cstheme="minorHAnsi"/>
-              </w:rPr>
-            </w:pPr>
-            <w:r>
-              <w:rPr>
-                <w:rFonts w:cs="Arial"/>
-              </w:rPr>
-              <w:t xml:space="preserve"> </w:t>
-            </w:r>
-            <w:r>
-              <w:rPr>
-                <w:rFonts w:cs="Arial"/>
-              </w:rPr>
-              <w:t>&lt;&lt;inventorMailingStreet</w:t>
-            </w:r>
-            <w:r>
-              <w:rPr>
-                <w:rFonts w:cs="Arial"/>
-              </w:rPr>
-              <w:t>2</w:t>
-            </w:r>
-            <w:r>
-              <w:rPr>
-                <w:rFonts w:cs="Arial"/>
-              </w:rPr>
-              <w:t>&gt;&gt;</w:t>
-            </w:r>
-          </w:p>
-        </w:tc>
-      </w:tr>
-      <w:tr>
-        <w:trPr>
-          <w:trHeight w:hRule="exact" w:val="360"/>
-        </w:trPr>
-        <w:tc>
-          <w:tcPr>
-            <w:tcW w:w="1063" w:type="dxa"/>
-            <w:gridSpan w:val="2"/>
-            <w:tcBorders>
-              <w:bottom w:val="single" w:sz="2" w:space="0" w:color="000000"/>
-            </w:tcBorders>
-            <w:vAlign w:val="center"/>
-          </w:tcPr>
-          <w:p>
-            <w:pPr>
-              <w:tabs>
-                <w:tab w:val="left" w:pos="1060"/>
-                <w:tab w:val="left" w:pos="5560"/>
-                <w:tab w:val="left" w:pos="7540"/>
-              </w:tabs>
-              <w:spacing w:after="0" w:line="240" w:lineRule="auto"/>
-              <w:ind w:left="144" w:right="-144"/>
-              <w:rPr>
-                <w:rFonts w:eastAsia="Arial" w:cstheme="minorHAnsi"/>
-              </w:rPr>
-            </w:pPr>
-            <w:r>
-              <w:rPr>
-                <w:rFonts w:eastAsia="Arial" w:cstheme="minorHAnsi"/>
-                <w:b/>
-                <w:bCs/>
-                <w:position w:val="6"/>
-              </w:rPr>
-              <w:t>City</w:t>
-            </w:r>
-            <w:r>
-              <w:rPr>
-                <w:rFonts w:eastAsia="Arial" w:cstheme="minorHAnsi"/>
-                <w:b/>
-                <w:bCs/>
-                <w:spacing w:val="-21"/>
-                <w:position w:val="6"/>
-              </w:rPr>
-              <w:t xml:space="preserve"> </w:t>
-            </w:r>
-          </w:p>
-        </w:tc>
-        <w:tc>
-          <w:tcPr>
-            <w:tcW w:w="4048" w:type="dxa"/>
-            <w:gridSpan w:val="7"/>
-            <w:tcBorders>
-              <w:bottom w:val="single" w:sz="2" w:space="0" w:color="000000"/>
-            </w:tcBorders>
-            <w:vAlign w:val="center"/>
-          </w:tcPr>
-          <w:p>
-            <w:pPr>
-              <w:tabs>
-                <w:tab w:val="left" w:pos="1060"/>
-                <w:tab w:val="left" w:pos="5560"/>
-                <w:tab w:val="left" w:pos="7540"/>
-              </w:tabs>
-              <w:spacing w:after="0" w:line="240" w:lineRule="auto"/>
-              <w:ind w:left="43" w:right="-144"/>
-              <w:rPr>
-                <w:rFonts w:eastAsia="Arial" w:cstheme="minorHAnsi"/>
-              </w:rPr>
-            </w:pPr>
-            <w:r>
-              <w:rPr>
-                <w:rFonts w:cs="Arial"/>
-                <w:bCs/>
-              </w:rPr>
-              <w:t>&lt;&lt;inventorMailingCity&gt;&gt;</w:t>
-            </w:r>
-          </w:p>
-        </w:tc>
-        <w:tc>
-          <w:tcPr>
-            <w:tcW w:w="1809" w:type="dxa"/>
-            <w:gridSpan w:val="3"/>
-            <w:tcBorders>
-              <w:bottom w:val="single" w:sz="2" w:space="0" w:color="000000"/>
-            </w:tcBorders>
-            <w:vAlign w:val="center"/>
-          </w:tcPr>
-          <w:p>
-            <w:pPr>
-              <w:tabs>
-                <w:tab w:val="left" w:pos="1060"/>
-                <w:tab w:val="left" w:pos="5560"/>
-                <w:tab w:val="left" w:pos="7540"/>
-              </w:tabs>
-              <w:spacing w:after="0" w:line="240" w:lineRule="auto"/>
-              <w:ind w:left="144" w:right="-144"/>
-              <w:rPr>
-                <w:rFonts w:eastAsia="Arial" w:cstheme="minorHAnsi"/>
-              </w:rPr>
-            </w:pPr>
-            <w:r>
-              <w:rPr>
-                <w:rFonts w:eastAsia="Arial" w:cstheme="minorHAnsi"/>
-                <w:b/>
-                <w:bCs/>
-                <w:w w:val="105"/>
-                <w:position w:val="6"/>
-              </w:rPr>
-              <w:t>State/Provinc</w:t>
-            </w:r>
-            <w:r>
-              <w:rPr>
-                <w:rFonts w:eastAsia="Arial" w:cstheme="minorHAnsi"/>
-                <w:b/>
-                <w:bCs/>
-                <w:w w:val="105"/>
-                <w:position w:val="6"/>
-              </w:rPr>
-              <w:t>e</w:t>
-            </w:r>
-          </w:p>
-        </w:tc>
-        <w:tc>
-          <w:tcPr>
-            <w:tcW w:w="3982" w:type="dxa"/>
-            <w:gridSpan w:val="4"/>
-            <w:tcBorders>
-              <w:bottom w:val="single" w:sz="2" w:space="0" w:color="000000"/>
-            </w:tcBorders>
-            <w:vAlign w:val="center"/>
-          </w:tcPr>
-          <w:p>
-            <w:pPr>
-              <w:tabs>
-                <w:tab w:val="left" w:pos="1060"/>
-                <w:tab w:val="left" w:pos="5560"/>
-                <w:tab w:val="left" w:pos="7540"/>
-              </w:tabs>
-              <w:spacing w:after="0" w:line="240" w:lineRule="auto"/>
-              <w:ind w:left="43" w:right="-144"/>
-              <w:rPr>
-                <w:rFonts w:eastAsia="Arial" w:cstheme="minorHAnsi"/>
-              </w:rPr>
-            </w:pPr>
-            <w:r>
-              <w:rPr>
-                <w:rFonts w:eastAsia="Arial" w:cstheme="minorHAnsi"/>
-                <w:bCs/>
-              </w:rPr>
-              <w:t>&lt;&lt;inventorMailingState&gt;&gt;</w:t>
-            </w:r>
-          </w:p>
-        </w:tc>
-      </w:tr>
-      <w:tr>
-        <w:trPr>
-          <w:trHeight w:hRule="exact" w:val="360"/>
-        </w:trPr>
-        <w:tc>
-          <w:tcPr>
-            <w:tcW w:w="2231" w:type="dxa"/>
-            <w:gridSpan w:val="4"/>
-            <w:tcBorders>
-              <w:bottom w:val="single" w:sz="2" w:space="0" w:color="000000"/>
-            </w:tcBorders>
-            <w:vAlign w:val="center"/>
-          </w:tcPr>
-          <w:p>
-            <w:pPr>
-              <w:tabs>
-                <w:tab w:val="left" w:pos="1060"/>
-                <w:tab w:val="left" w:pos="5560"/>
-                <w:tab w:val="left" w:pos="7540"/>
-              </w:tabs>
-              <w:spacing w:after="0" w:line="240" w:lineRule="auto"/>
-              <w:ind w:left="144"/>
-              <w:rPr>
-                <w:rFonts w:eastAsia="Arial" w:cstheme="minorHAnsi"/>
-              </w:rPr>
-            </w:pPr>
-            <w:r>
-              <w:rPr>
-                <w:rFonts w:eastAsia="Arial" w:cstheme="minorHAnsi"/>
-                <w:b/>
-                <w:bCs/>
-              </w:rPr>
-              <w:t>Postal</w:t>
-            </w:r>
-            <w:r>
-              <w:rPr>
-                <w:rFonts w:eastAsia="Arial" w:cstheme="minorHAnsi"/>
-                <w:b/>
-                <w:bCs/>
-                <w:spacing w:val="23"/>
-              </w:rPr>
-              <w:t xml:space="preserve"> </w:t>
-            </w:r>
-            <w:r>
-              <w:rPr>
-                <w:rFonts w:eastAsia="Arial" w:cstheme="minorHAnsi"/>
-                <w:b/>
-                <w:bCs/>
-                <w:w w:val="106"/>
-              </w:rPr>
-              <w:t>Code</w:t>
-            </w:r>
-          </w:p>
-        </w:tc>
-        <w:tc>
-          <w:tcPr>
-            <w:tcW w:w="2880" w:type="dxa"/>
-            <w:gridSpan w:val="5"/>
-            <w:tcBorders>
-              <w:bottom w:val="single" w:sz="2" w:space="0" w:color="000000"/>
-            </w:tcBorders>
-            <w:vAlign w:val="center"/>
-          </w:tcPr>
-          <w:p>
-            <w:pPr>
-              <w:tabs>
-                <w:tab w:val="left" w:pos="1060"/>
-                <w:tab w:val="left" w:pos="5560"/>
-                <w:tab w:val="left" w:pos="7540"/>
-              </w:tabs>
-              <w:spacing w:after="0" w:line="240" w:lineRule="auto"/>
-              <w:ind w:left="43"/>
-              <w:rPr>
-                <w:rFonts w:eastAsia="Arial" w:cstheme="minorHAnsi"/>
-              </w:rPr>
-            </w:pPr>
-            <w:r>
-              <w:rPr>
-                <w:rFonts w:eastAsia="Arial" w:cstheme="minorHAnsi"/>
-                <w:bCs/>
-              </w:rPr>
-              <w:t>&lt;&lt;inventorMailingZip&gt;&gt;</w:t>
-            </w:r>
-          </w:p>
-        </w:tc>
-        <w:tc>
-          <w:tcPr>
-            <w:tcW w:w="1170" w:type="dxa"/>
-            <w:tcBorders>
-              <w:bottom w:val="single" w:sz="2" w:space="0" w:color="000000"/>
-            </w:tcBorders>
-            <w:vAlign w:val="center"/>
-          </w:tcPr>
-          <w:p>
-            <w:pPr>
-              <w:tabs>
-                <w:tab w:val="left" w:pos="1060"/>
-                <w:tab w:val="left" w:pos="5560"/>
-                <w:tab w:val="left" w:pos="7540"/>
-              </w:tabs>
-              <w:spacing w:after="0" w:line="240" w:lineRule="auto"/>
-              <w:ind w:left="144"/>
-              <w:rPr>
-                <w:rFonts w:eastAsia="Arial" w:cstheme="minorHAnsi"/>
-                <w:b/>
-              </w:rPr>
-            </w:pPr>
-            <w:r>
-              <w:rPr>
-                <w:rFonts w:eastAsia="Arial" w:cstheme="minorHAnsi"/>
-                <w:b/>
-              </w:rPr>
-              <w:t>Country</w:t>
-            </w:r>
-          </w:p>
-        </w:tc>
-        <w:tc>
-          <w:tcPr>
-            <w:tcW w:w="4621" w:type="dxa"/>
-            <w:gridSpan w:val="6"/>
-            <w:tcBorders>
-              <w:bottom w:val="single" w:sz="2" w:space="0" w:color="000000"/>
-            </w:tcBorders>
-            <w:vAlign w:val="center"/>
-          </w:tcPr>
-          <w:p>
-            <w:pPr>
-              <w:tabs>
-                <w:tab w:val="left" w:pos="1060"/>
-                <w:tab w:val="left" w:pos="5560"/>
-                <w:tab w:val="left" w:pos="7540"/>
-              </w:tabs>
-              <w:spacing w:after="0" w:line="240" w:lineRule="auto"/>
-              <w:ind w:left="43"/>
-              <w:rPr>
-                <w:rFonts w:eastAsia="Arial" w:cstheme="minorHAnsi"/>
-              </w:rPr>
-            </w:pPr>
-            <w:r>
-              <w:rPr>
-                <w:rFonts w:eastAsia="Arial" w:cstheme="minorHAnsi"/>
-                <w:bCs/>
-              </w:rPr>
-              <w:t>&lt;&lt;inventorMailingCountry&gt;&gt;</w:t>
-            </w:r>
-          </w:p>
-        </w:tc>
-      </w:tr>
-    </w:tbl>
     <w:p>
       <w:pPr>
         <w:spacing w:after="0" w:line="120" w:lineRule="auto"/>
@@ -2046,7 +513,16 @@
         <w:sz w:val="13"/>
         <w:szCs w:val="13"/>
       </w:rPr>
-      <w:t xml:space="preserve">PTO/AIA/14 </w:t>
+      <w:t>PTO/AIA/</w:t>
+    </w:r>
+    <w:proofErr w:type="gramStart"/>
+    <w:r>
+      <w:rPr>
+        <w:rFonts w:ascii="Arial" w:eastAsia="Arial" w:hAnsi="Arial" w:cs="Arial"/>
+        <w:sz w:val="13"/>
+        <w:szCs w:val="13"/>
+      </w:rPr>
+      <w:t xml:space="preserve">14 </w:t>
     </w:r>
     <w:r>
       <w:rPr>
@@ -2064,7 +540,17 @@
         <w:sz w:val="13"/>
         <w:szCs w:val="13"/>
       </w:rPr>
-      <w:t>(01-22</w:t>
+      <w:t>(</w:t>
+    </w:r>
+    <w:proofErr w:type="gramEnd"/>
+    <w:r>
+      <w:rPr>
+        <w:rFonts w:ascii="Arial" w:eastAsia="Arial" w:hAnsi="Arial" w:cs="Arial"/>
+        <w:w w:val="108"/>
+        <w:sz w:val="13"/>
+        <w:szCs w:val="13"/>
+      </w:rPr>
+      <w:t>01-22</w:t>
     </w:r>
     <w:r>
       <w:rPr>
@@ -2484,6 +970,7 @@
       </w:rPr>
       <w:t xml:space="preserve"> </w:t>
     </w:r>
+    <w:proofErr w:type="gramStart"/>
     <w:r>
       <w:rPr>
         <w:rFonts w:ascii="Arial" w:eastAsia="Arial" w:hAnsi="Arial" w:cs="Arial"/>
@@ -2509,6 +996,7 @@
       </w:rPr>
       <w:t>are</w:t>
     </w:r>
+    <w:proofErr w:type="gramEnd"/>
     <w:r>
       <w:rPr>
         <w:rFonts w:ascii="Arial" w:eastAsia="Arial" w:hAnsi="Arial" w:cs="Arial"/>

</xml_diff>

<commit_message>
Worked on multiple assignee and applicant tables. Started UI for 'generalxmitCF' merge.
</commit_message>
<xml_diff>
--- a/project/documents/formaldocuments/ApplicationDataSheet_NEW2inventor.docx
+++ b/project/documents/formaldocuments/ApplicationDataSheet_NEW2inventor.docx
@@ -238,19 +238,7 @@
           <w:sz w:val="28"/>
           <w:szCs w:val="28"/>
         </w:rPr>
-        <w:t xml:space="preserve">  </w:t>
-      </w:r>
-      <w:r>
-        <w:rPr>
-          <w:rFonts w:eastAsia="Arial" w:cstheme="minorHAnsi"/>
-          <w:b/>
-          <w:bCs/>
-          <w:w w:val="92"/>
-          <w:position w:val="-1"/>
-          <w:sz w:val="28"/>
-          <w:szCs w:val="28"/>
-        </w:rPr>
-        <w:t>Inventor</w:t>
+        <w:t xml:space="preserve">  Inventor</w:t>
       </w:r>
       <w:r>
         <w:rPr>
@@ -264,32 +252,6 @@
         </w:rPr>
         <w:t xml:space="preserve"> Information:</w:t>
       </w:r>
-      <w:r>
-        <w:rPr>
-          <w:rFonts w:eastAsia="Arial" w:cstheme="minorHAnsi"/>
-          <w:b/>
-          <w:bCs/>
-          <w:w w:val="92"/>
-          <w:position w:val="-1"/>
-          <w:sz w:val="28"/>
-          <w:szCs w:val="28"/>
-        </w:rPr>
-        <w:tab/>
-      </w:r>
-    </w:p>
-    <w:p>
-      <w:pPr>
-        <w:spacing w:after="0" w:line="120" w:lineRule="auto"/>
-        <w:ind w:right="-14"/>
-        <w:rPr>
-          <w:rFonts w:eastAsia="Arial" w:cstheme="minorHAnsi"/>
-          <w:bCs/>
-          <w:w w:val="107"/>
-          <w:position w:val="-1"/>
-          <w:sz w:val="20"/>
-          <w:szCs w:val="20"/>
-        </w:rPr>
-      </w:pPr>
     </w:p>
     <w:sectPr>
       <w:headerReference w:type="even" r:id="rId8"/>

</xml_diff>